<commit_message>
Improve proposal column flow
</commit_message>
<xml_diff>
--- a/proposal/Research_Proposal_Submission_Final.docx
+++ b/proposal/Research_Proposal_Submission_Final.docx
@@ -249,14 +249,6 @@
           <w:sz w:val="18"/>
         </w:rPr>
         <w:t xml:space="preserve"> split derived from Dollar Street [3], which provides image, country, region, object, and monthly household-income metadata. The fixed subset contains 168 unique images from 44 countries: roof, light source, stove, trash container, switch, and footwear, with seven images in each category x quartile cell (6 x 4 x 7). Ambiguous multi-class rows are excluded. Broader study labels and predeclared synonyms avoid penalizing culturally valid forms such as lanterns or sandals.</w:t>
-      </w:r>
-    </w:p>
-    <w:p>
-      <w:pPr>
-        <w:spacing w:before="0" w:after="0"/>
-      </w:pPr>
-      <w:r>
-        <w:br w:type="column"/>
       </w:r>
     </w:p>
     <w:p>
@@ -12614,6 +12606,7 @@
   <w:style w:type="paragraph" w:customStyle="1" w:styleId="ProposalBullet">
     <w:name w:val="Proposal Bullet"/>
     <w:pPr>
+      <w:keepLines/>
       <w:widowControl/>
       <w:spacing w:before="0" w:after="36" w:line="247" w:lineRule="auto"/>
       <w:ind w:left="540" w:hanging="279"/>

</xml_diff>

<commit_message>
Complete full-page proposal details
</commit_message>
<xml_diff>
--- a/proposal/Research_Proposal_Submission_Final.docx
+++ b/proposal/Research_Proposal_Submission_Final.docx
@@ -502,6 +502,50 @@
     </w:p>
     <w:p>
       <w:pPr>
+        <w:pStyle w:val="Heading2"/>
+        <w:keepNext/>
+      </w:pPr>
+      <w:r>
+        <w:t>Reproducibility and Validity Controls</w:t>
+      </w:r>
+    </w:p>
+    <w:p>
+      <w:pPr/>
+      <w:r>
+        <w:rPr>
+          <w:rFonts w:ascii="Arial" w:hAnsi="Arial"/>
+          <w:b w:val="0"/>
+          <w:i w:val="0"/>
+          <w:color w:val="1A202C"/>
+          <w:sz w:val="18"/>
+        </w:rPr>
+        <w:t>Image IDs, selection rules, model checkpoints, software versions, prompt strings, decoding settings, and random seeds will be fixed and logged before the full evaluation. Labels and accepted synonyms will not be changed after model outputs are inspected. Every CLIP score, caption, automated judgment, and adjudicated human label will be saved in analysis-ready CSV files. Before rating begins, the team will agree on written definitions of a correct object reference, a non-informative caption, and a hallucination. Independent ratings will be locked before disagreements are discussed.</w:t>
+      </w:r>
+    </w:p>
+    <w:p>
+      <w:pPr>
+        <w:pStyle w:val="Heading2"/>
+        <w:keepNext/>
+      </w:pPr>
+      <w:r>
+        <w:t>Risks and Responsible Reporting</w:t>
+      </w:r>
+    </w:p>
+    <w:p>
+      <w:pPr/>
+      <w:r>
+        <w:rPr>
+          <w:rFonts w:ascii="Arial" w:hAnsi="Arial"/>
+          <w:b w:val="0"/>
+          <w:i w:val="0"/>
+          <w:color w:val="1A202C"/>
+          <w:sz w:val="18"/>
+        </w:rPr>
+        <w:t>Household income is contextual metadata, not evidence that income causes a prediction. The small, deliberately balanced subset cannot represent every culture, object type, or vision-language model, and category selection may introduce selection bias. We will therefore avoid country rankings, keep regional comparisons exploratory, and report denominators beside every subgroup result. Accepted-term recall can miss valid wording or reward a keyword in an otherwise incorrect caption, so conclusions will be checked against blinded human ratings. Dollar Street's CC-BY 4.0 attribution will be retained; the repository will provide access instructions instead of redistributing the full dataset, and demo examples will include source attribution.</w:t>
+      </w:r>
+    </w:p>
+    <w:p>
+      <w:pPr>
         <w:spacing w:before="70" w:after="0" w:line="240" w:lineRule="auto"/>
       </w:pPr>
       <w:r>

</xml_diff>

<commit_message>
Add proposal authors and page number
</commit_message>
<xml_diff>
--- a/proposal/Research_Proposal_Submission_Final.docx
+++ b/proposal/Research_Proposal_Submission_Final.docx
@@ -20,11 +20,8 @@
     </w:p>
     <w:p>
       <w:pPr>
-        <w:spacing w:before="0" w:after="80"/>
+        <w:spacing w:before="0" w:after="10"/>
         <w:jc w:val="center"/>
-        <w:pBdr>
-          <w:bottom w:val="single" w:sz="5" w:space="3" w:color="B8C2CC"/>
-        </w:pBdr>
       </w:pPr>
       <w:r>
         <w:rPr>
@@ -39,7 +36,27 @@
     </w:p>
     <w:p>
       <w:pPr>
+        <w:spacing w:before="0" w:after="80"/>
+        <w:jc w:val="center"/>
+        <w:pBdr>
+          <w:bottom w:val="single" w:sz="5" w:space="3" w:color="B8C2CC"/>
+        </w:pBdr>
+      </w:pPr>
+      <w:r>
+        <w:rPr>
+          <w:rFonts w:ascii="Arial" w:hAnsi="Arial"/>
+          <w:b/>
+          <w:i w:val="0"/>
+          <w:color w:val="1A202C"/>
+          <w:sz w:val="17"/>
+        </w:rPr>
+        <w:t>Diya Tiwari | Riya Katikar</w:t>
+      </w:r>
+    </w:p>
+    <w:p>
+      <w:pPr>
         <w:sectPr>
+          <w:footerReference w:type="default" r:id="rId9"/>
           <w:pgSz w:w="11906" w:h="16838"/>
           <w:pgMar w:top="749" w:right="835" w:bottom="691" w:left="835" w:header="288" w:footer="288" w:gutter="0"/>
           <w:cols w:space="360" w:num="1" w:equalWidth="1"/>
@@ -570,6 +587,28 @@
 </w:document>
 </file>
 
+<file path=word/footer1.xml><?xml version="1.0" encoding="utf-8"?>
+<w:ftr xmlns:m="http://schemas.openxmlformats.org/officeDocument/2006/math" xmlns:mc="http://schemas.openxmlformats.org/markup-compatibility/2006" xmlns:mo="http://schemas.microsoft.com/office/mac/office/2008/main" xmlns:mv="urn:schemas-microsoft-com:mac:vml" xmlns:o="urn:schemas-microsoft-com:office:office" xmlns:r="http://schemas.openxmlformats.org/officeDocument/2006/relationships" xmlns:v="urn:schemas-microsoft-com:vml" xmlns:w10="urn:schemas-microsoft-com:office:word" xmlns:w14="http://schemas.microsoft.com/office/word/2010/wordml" xmlns:w="http://schemas.openxmlformats.org/wordprocessingml/2006/main" xmlns:wne="http://schemas.microsoft.com/office/word/2006/wordml" xmlns:wp14="http://schemas.microsoft.com/office/word/2010/wordprocessingDrawing" xmlns:wp="http://schemas.openxmlformats.org/drawingml/2006/wordprocessingDrawing" xmlns:wpc="http://schemas.microsoft.com/office/word/2010/wordprocessingCanvas" xmlns:wpg="http://schemas.microsoft.com/office/word/2010/wordprocessingGroup" xmlns:wpi="http://schemas.microsoft.com/office/word/2010/wordprocessingInk" xmlns:wps="http://schemas.microsoft.com/office/word/2010/wordprocessingShape" mc:Ignorable="w14 wp14">
+  <w:p>
+    <w:pPr>
+      <w:pStyle w:val="Footer"/>
+      <w:spacing w:before="0" w:after="0"/>
+      <w:jc w:val="center"/>
+    </w:pPr>
+    <w:r>
+      <w:rPr>
+        <w:rFonts w:ascii="Arial" w:hAnsi="Arial"/>
+        <w:b w:val="0"/>
+        <w:i w:val="0"/>
+        <w:color w:val="586069"/>
+        <w:sz w:val="15"/>
+      </w:rPr>
+      <w:t>1</w:t>
+    </w:r>
+  </w:p>
+</w:ftr>
+</file>
+
 <file path=word/numbering.xml><?xml version="1.0" encoding="utf-8"?>
 <w:numbering xmlns:wpc="http://schemas.microsoft.com/office/word/2010/wordprocessingCanvas" xmlns:mo="http://schemas.microsoft.com/office/mac/office/2008/main" xmlns:mc="http://schemas.openxmlformats.org/markup-compatibility/2006" xmlns:mv="urn:schemas-microsoft-com:mac:vml" xmlns:o="urn:schemas-microsoft-com:office:office" xmlns:r="http://schemas.openxmlformats.org/officeDocument/2006/relationships" xmlns:m="http://schemas.openxmlformats.org/officeDocument/2006/math" xmlns:v="urn:schemas-microsoft-com:vml" xmlns:wp14="http://schemas.microsoft.com/office/word/2010/wordprocessingDrawing" xmlns:wp="http://schemas.openxmlformats.org/drawingml/2006/wordprocessingDrawing" xmlns:w10="urn:schemas-microsoft-com:office:word" xmlns:w="http://schemas.openxmlformats.org/wordprocessingml/2006/main" xmlns:w14="http://schemas.microsoft.com/office/word/2010/wordml" xmlns:wpg="http://schemas.microsoft.com/office/word/2010/wordprocessingGroup" xmlns:wpi="http://schemas.microsoft.com/office/word/2010/wordprocessingInk" xmlns:wne="http://schemas.microsoft.com/office/word/2006/wordml" xmlns:wps="http://schemas.microsoft.com/office/word/2010/wordprocessingShape" mc:Ignorable="w14 wp14">
   <w:abstractNum w:abstractNumId="0">

</xml_diff>